<commit_message>
Added 2nd Feature Branch
</commit_message>
<xml_diff>
--- a/Devops CA2 project.docx
+++ b/Devops CA2 project.docx
@@ -4,6 +4,32 @@
   <w:body>
     <w:p>
       <w:r>
+        <w:t xml:space="preserve">GITHUB : </w:t>
+      </w:r>
+      <w:hyperlink r:id="rId5" w:history="1">
+        <w:r>
+          <w:rPr>
+            <w:rStyle w:val="Hyperlink"/>
+          </w:rPr>
+          <w:t>https://github.com/MDAzhar77</w:t>
+        </w:r>
+        <w:r>
+          <w:rPr>
+            <w:rStyle w:val="Hyperlink"/>
+          </w:rPr>
+          <w:t>9</w:t>
+        </w:r>
+        <w:r>
+          <w:rPr>
+            <w:rStyle w:val="Hyperlink"/>
+          </w:rPr>
+          <w:t>9/Linux-File-Monitoring-Auto-Backup1</w:t>
+        </w:r>
+      </w:hyperlink>
+    </w:p>
+    <w:p/>
+    <w:p>
+      <w:r>
         <w:t>Submission of Project Title with Synopsis </w:t>
       </w:r>
     </w:p>
@@ -70,13 +96,7 @@
         <w:t xml:space="preserve">:  </w:t>
       </w:r>
       <w:r>
-        <w:t xml:space="preserve">Linux is one of the most powerful and secure operating systems widely used in servers, data </w:t>
-      </w:r>
-      <w:r>
-        <w:t>centres</w:t>
-      </w:r>
-      <w:r>
-        <w:t>, and enterprise environments.</w:t>
+        <w:t>Linux is one of the most powerful and secure operating systems widely used in servers, data centres, and enterprise environments.</w:t>
       </w:r>
       <w:r>
         <w:br/>
@@ -506,6 +526,7 @@
           <w:lang w:eastAsia="en-IN"/>
           <w14:ligatures w14:val="none"/>
         </w:rPr>
+        <w:lastRenderedPageBreak/>
         <w:t>This project solves the problem by:</w:t>
       </w:r>
     </w:p>
@@ -581,7 +602,6 @@
           <w:lang w:eastAsia="en-IN"/>
           <w14:ligatures w14:val="none"/>
         </w:rPr>
-        <w:lastRenderedPageBreak/>
         <w:t>✔</w:t>
       </w:r>
       <w:r>
@@ -851,13 +871,7 @@
         </w:numPr>
       </w:pPr>
       <w:r>
-        <w:t xml:space="preserve">Linux Commands: inotifywait, </w:t>
-      </w:r>
-      <w:r>
-        <w:t>resync</w:t>
-      </w:r>
-      <w:r>
-        <w:t>, cp, mv, tar</w:t>
+        <w:t>Linux Commands: inotifywait, resync, cp, mv, tar</w:t>
       </w:r>
     </w:p>
     <w:p>
@@ -912,7 +926,15 @@
         </w:numPr>
       </w:pPr>
       <w:r>
-        <w:t>Write a shell script using inotify-tools or cron to detect file changes.</w:t>
+        <w:t xml:space="preserve">Write a shell script using </w:t>
+      </w:r>
+      <w:proofErr w:type="spellStart"/>
+      <w:r>
+        <w:t>inotify</w:t>
+      </w:r>
+      <w:proofErr w:type="spellEnd"/>
+      <w:r>
+        <w:t>-tools or cron to detect file changes.</w:t>
       </w:r>
     </w:p>
     <w:p>
@@ -936,6 +958,7 @@
         </w:numPr>
       </w:pPr>
       <w:r>
+        <w:lastRenderedPageBreak/>
         <w:t>Store backups with timestamps.</w:t>
       </w:r>
     </w:p>
@@ -972,7 +995,6 @@
         </w:numPr>
       </w:pPr>
       <w:r>
-        <w:lastRenderedPageBreak/>
         <w:t>Schedule automatic runs using cron if needed.</w:t>
       </w:r>
     </w:p>
@@ -1743,7 +1765,23 @@
           <w:b/>
           <w:bCs/>
         </w:rPr>
-        <w:t>References                                                                                                                                                                                     Front page format is : SYNOPSIS</w:t>
+        <w:t xml:space="preserve">References                                                                                                                                                                                     Front page format </w:t>
+      </w:r>
+      <w:proofErr w:type="gramStart"/>
+      <w:r>
+        <w:rPr>
+          <w:b/>
+          <w:bCs/>
+        </w:rPr>
+        <w:t>is :</w:t>
+      </w:r>
+      <w:proofErr w:type="gramEnd"/>
+      <w:r>
+        <w:rPr>
+          <w:b/>
+          <w:bCs/>
+        </w:rPr>
+        <w:t> SYNOPSIS</w:t>
       </w:r>
     </w:p>
     <w:p>
@@ -3790,6 +3828,7 @@
   <w:style w:type="character" w:default="1" w:styleId="DefaultParagraphFont">
     <w:name w:val="Default Paragraph Font"/>
     <w:uiPriority w:val="1"/>
+    <w:semiHidden/>
     <w:unhideWhenUsed/>
   </w:style>
   <w:style w:type="table" w:default="1" w:styleId="TableNormal">
@@ -4125,6 +4164,41 @@
       <w:bCs/>
     </w:rPr>
   </w:style>
+  <w:style w:type="character" w:styleId="Hyperlink">
+    <w:name w:val="Hyperlink"/>
+    <w:basedOn w:val="DefaultParagraphFont"/>
+    <w:uiPriority w:val="99"/>
+    <w:unhideWhenUsed/>
+    <w:rsid w:val="00C04486"/>
+    <w:rPr>
+      <w:color w:val="467886" w:themeColor="hyperlink"/>
+      <w:u w:val="single"/>
+    </w:rPr>
+  </w:style>
+  <w:style w:type="character" w:styleId="UnresolvedMention">
+    <w:name w:val="Unresolved Mention"/>
+    <w:basedOn w:val="DefaultParagraphFont"/>
+    <w:uiPriority w:val="99"/>
+    <w:semiHidden/>
+    <w:unhideWhenUsed/>
+    <w:rsid w:val="00C04486"/>
+    <w:rPr>
+      <w:color w:val="605E5C"/>
+      <w:shd w:val="clear" w:color="auto" w:fill="E1DFDD"/>
+    </w:rPr>
+  </w:style>
+  <w:style w:type="character" w:styleId="FollowedHyperlink">
+    <w:name w:val="FollowedHyperlink"/>
+    <w:basedOn w:val="DefaultParagraphFont"/>
+    <w:uiPriority w:val="99"/>
+    <w:semiHidden/>
+    <w:unhideWhenUsed/>
+    <w:rsid w:val="00C04486"/>
+    <w:rPr>
+      <w:color w:val="96607D" w:themeColor="followedHyperlink"/>
+      <w:u w:val="single"/>
+    </w:rPr>
+  </w:style>
 </w:styles>
 </file>
 

</xml_diff>